<commit_message>
Se modifica portada versión 2.0
</commit_message>
<xml_diff>
--- a/manual-aplicativo-validador-rem-ver-2.0.docx
+++ b/manual-aplicativo-validador-rem-ver-2.0.docx
@@ -1189,18 +1189,16 @@
                                     </w:rPr>
                                     <w:t xml:space="preserve">Versión </w:t>
                                   </w:r>
-                                  <w:ins w:id="0" w:author="Rolando Andrés Cifuentes Cid" w:date="2026-03-10T09:22:00Z" w16du:dateUtc="2026-03-10T12:22:00Z">
-                                    <w:r>
-                                      <w:rPr>
-                                        <w:b/>
-                                        <w:bCs/>
-                                        <w:color w:val="808080" w:themeColor="text1" w:themeTint="7F"/>
-                                        <w:sz w:val="32"/>
-                                        <w:szCs w:val="32"/>
-                                      </w:rPr>
-                                      <w:t>2.0</w:t>
-                                    </w:r>
-                                  </w:ins>
+                                  <w:r>
+                                    <w:rPr>
+                                      <w:b/>
+                                      <w:bCs/>
+                                      <w:color w:val="808080" w:themeColor="text1" w:themeTint="7F"/>
+                                      <w:sz w:val="32"/>
+                                      <w:szCs w:val="32"/>
+                                    </w:rPr>
+                                    <w:t>2.0</w:t>
+                                  </w:r>
                                 </w:p>
                               </w:txbxContent>
                             </wps:txbx>
@@ -1480,18 +1478,16 @@
                               </w:rPr>
                               <w:t xml:space="preserve">Versión </w:t>
                             </w:r>
-                            <w:ins w:id="1" w:author="Rolando Andrés Cifuentes Cid" w:date="2026-03-10T09:22:00Z" w16du:dateUtc="2026-03-10T12:22:00Z">
-                              <w:r>
-                                <w:rPr>
-                                  <w:b/>
-                                  <w:bCs/>
-                                  <w:color w:val="808080" w:themeColor="text1" w:themeTint="7F"/>
-                                  <w:sz w:val="32"/>
-                                  <w:szCs w:val="32"/>
-                                </w:rPr>
-                                <w:t>2.0</w:t>
-                              </w:r>
-                            </w:ins>
+                            <w:r>
+                              <w:rPr>
+                                <w:b/>
+                                <w:bCs/>
+                                <w:color w:val="808080" w:themeColor="text1" w:themeTint="7F"/>
+                                <w:sz w:val="32"/>
+                                <w:szCs w:val="32"/>
+                              </w:rPr>
+                              <w:t>2.0</w:t>
+                            </w:r>
                           </w:p>
                         </w:txbxContent>
                       </v:textbox>
@@ -1524,6 +1520,13 @@
         </w:p>
         <w:sdt>
           <w:sdtPr>
+            <w:rPr>
+              <w:caps w:val="0"/>
+              <w:color w:val="auto"/>
+              <w:spacing w:val="0"/>
+              <w:sz w:val="22"/>
+              <w:szCs w:val="22"/>
+            </w:rPr>
             <w:id w:val="-60957420"/>
             <w:docPartObj>
               <w:docPartGallery w:val="Table of Contents"/>
@@ -1534,11 +1537,6 @@
             <w:rPr>
               <w:b/>
               <w:bCs/>
-              <w:caps w:val="0"/>
-              <w:color w:val="auto"/>
-              <w:spacing w:val="0"/>
-              <w:sz w:val="22"/>
-              <w:szCs w:val="22"/>
             </w:rPr>
           </w:sdtEndPr>
           <w:sdtContent>
@@ -2170,7 +2168,7 @@
     <w:p>
       <w:pPr>
         <w:rPr>
-          <w:del w:id="2" w:author="Karina Stapfer Jara" w:date="2025-11-11T14:48:00Z" w16du:dateUtc="2025-11-11T17:48:00Z"/>
+          <w:del w:id="0" w:author="Karina Stapfer Jara" w:date="2025-11-11T14:48:00Z" w16du:dateUtc="2025-11-11T17:48:00Z"/>
           <w:b/>
           <w:bCs/>
           <w:color w:val="2E74B5" w:themeColor="accent1" w:themeShade="BF"/>
@@ -2180,14 +2178,14 @@
       </w:pPr>
     </w:p>
     <w:p>
-      <w:bookmarkStart w:id="3" w:name="_Toc201653894"/>
-      <w:bookmarkStart w:id="4" w:name="_Toc213764890"/>
+      <w:bookmarkStart w:id="1" w:name="_Toc201653894"/>
+      <w:bookmarkStart w:id="2" w:name="_Toc213764890"/>
       <w:r>
         <w:lastRenderedPageBreak/>
         <w:t>INTRODUCCIÓN</w:t>
       </w:r>
-      <w:bookmarkEnd w:id="3"/>
-      <w:bookmarkEnd w:id="4"/>
+      <w:bookmarkEnd w:id="1"/>
+      <w:bookmarkEnd w:id="2"/>
     </w:p>
     <w:p/>
     <w:p>
@@ -2241,7 +2239,7 @@
           <w:szCs w:val="20"/>
         </w:rPr>
       </w:pPr>
-      <w:bookmarkStart w:id="5" w:name="_Toc213764891"/>
+      <w:bookmarkStart w:id="3" w:name="_Toc213764891"/>
     </w:p>
     <w:p>
       <w:pPr>
@@ -2256,7 +2254,7 @@
           <w:szCs w:val="20"/>
         </w:rPr>
       </w:pPr>
-      <w:bookmarkStart w:id="6" w:name="_Toc224039360"/>
+      <w:bookmarkStart w:id="4" w:name="_Toc224039360"/>
     </w:p>
     <w:p>
       <w:pPr>
@@ -2281,8 +2279,8 @@
         </w:rPr>
         <w:t>ALCANCE</w:t>
       </w:r>
-      <w:bookmarkEnd w:id="5"/>
-      <w:bookmarkEnd w:id="6"/>
+      <w:bookmarkEnd w:id="3"/>
+      <w:bookmarkEnd w:id="4"/>
     </w:p>
     <w:p>
       <w:pPr>
@@ -2386,7 +2384,7 @@
           <w:szCs w:val="20"/>
         </w:rPr>
       </w:pPr>
-      <w:bookmarkStart w:id="7" w:name="_Toc224039361"/>
+      <w:bookmarkStart w:id="5" w:name="_Toc224039361"/>
     </w:p>
     <w:p>
       <w:pPr>
@@ -2411,7 +2409,7 @@
         </w:rPr>
         <w:t>ACTUALIZACION DE VERSIONES DE SERIES REM</w:t>
       </w:r>
-      <w:bookmarkEnd w:id="7"/>
+      <w:bookmarkEnd w:id="5"/>
     </w:p>
     <w:p>
       <w:pPr>
@@ -2438,7 +2436,7 @@
           <w:szCs w:val="20"/>
         </w:rPr>
       </w:pPr>
-      <w:bookmarkStart w:id="8" w:name="_Toc224039362"/>
+      <w:bookmarkStart w:id="6" w:name="_Toc224039362"/>
       <w:r>
         <w:rPr>
           <w:rFonts w:ascii="Segoe UI Light" w:hAnsi="Segoe UI Light" w:cs="Segoe UI Light"/>
@@ -2447,7 +2445,7 @@
         </w:rPr>
         <w:t>Se realizaron modificaciones en los archivos de configuración del sistema para incorporar nuevas versiones de las series REM utilizadas en el proceso de validación.</w:t>
       </w:r>
-      <w:bookmarkEnd w:id="8"/>
+      <w:bookmarkEnd w:id="6"/>
     </w:p>
     <w:p>
       <w:pPr>
@@ -2460,7 +2458,7 @@
           <w:szCs w:val="20"/>
         </w:rPr>
       </w:pPr>
-      <w:bookmarkStart w:id="9" w:name="_Toc224039363"/>
+      <w:bookmarkStart w:id="7" w:name="_Toc224039363"/>
       <w:r>
         <w:rPr>
           <w:rFonts w:ascii="Segoe UI Light" w:hAnsi="Segoe UI Light" w:cs="Segoe UI Light"/>
@@ -2477,7 +2475,7 @@
         </w:rPr>
         <w:t>:</w:t>
       </w:r>
-      <w:bookmarkEnd w:id="9"/>
+      <w:bookmarkEnd w:id="7"/>
       <w:r>
         <w:rPr>
           <w:rFonts w:ascii="Segoe UI Light" w:hAnsi="Segoe UI Light" w:cs="Segoe UI Light"/>
@@ -2503,44 +2501,16 @@
           <w:szCs w:val="20"/>
         </w:rPr>
       </w:pPr>
-      <w:bookmarkStart w:id="10" w:name="_Toc224039364"/>
-      <w:r>
-        <w:rPr>
-          <w:rFonts w:ascii="Segoe UI Light" w:hAnsi="Segoe UI Light" w:cs="Segoe UI Light"/>
-          <w:sz w:val="20"/>
-          <w:szCs w:val="20"/>
-        </w:rPr>
-        <w:t>S</w:t>
-      </w:r>
-      <w:r>
-        <w:rPr>
-          <w:rFonts w:ascii="Segoe UI Light" w:hAnsi="Segoe UI Light" w:cs="Segoe UI Light"/>
-          <w:sz w:val="20"/>
-          <w:szCs w:val="20"/>
-        </w:rPr>
-        <w:t>e actualizó el archivo control-</w:t>
-      </w:r>
-      <w:proofErr w:type="spellStart"/>
-      <w:proofErr w:type="gramStart"/>
-      <w:r>
-        <w:rPr>
-          <w:rFonts w:ascii="Segoe UI Light" w:hAnsi="Segoe UI Light" w:cs="Segoe UI Light"/>
-          <w:sz w:val="20"/>
-          <w:szCs w:val="20"/>
-        </w:rPr>
-        <w:t>versiones.json</w:t>
-      </w:r>
-      <w:proofErr w:type="spellEnd"/>
-      <w:proofErr w:type="gramEnd"/>
-      <w:r>
-        <w:rPr>
-          <w:rFonts w:ascii="Segoe UI Light" w:hAnsi="Segoe UI Light" w:cs="Segoe UI Light"/>
-          <w:sz w:val="20"/>
-          <w:szCs w:val="20"/>
-        </w:rPr>
-        <w:t>.</w:t>
-      </w:r>
-      <w:bookmarkEnd w:id="10"/>
+      <w:bookmarkStart w:id="8" w:name="_Toc224039364"/>
+      <w:r>
+        <w:rPr>
+          <w:rFonts w:ascii="Segoe UI Light" w:hAnsi="Segoe UI Light" w:cs="Segoe UI Light"/>
+          <w:sz w:val="20"/>
+          <w:szCs w:val="20"/>
+        </w:rPr>
+        <w:t>Se actualizó el archivo control-versiones.json.</w:t>
+      </w:r>
+      <w:bookmarkEnd w:id="8"/>
     </w:p>
     <w:p>
       <w:pPr>
@@ -2558,36 +2528,16 @@
           <w:szCs w:val="20"/>
         </w:rPr>
       </w:pPr>
-      <w:bookmarkStart w:id="11" w:name="_Toc224039365"/>
-      <w:r>
-        <w:rPr>
-          <w:rFonts w:ascii="Segoe UI Light" w:hAnsi="Segoe UI Light" w:cs="Segoe UI Light"/>
-          <w:sz w:val="20"/>
-          <w:szCs w:val="20"/>
-        </w:rPr>
-        <w:t xml:space="preserve">Se actualizó el archivo </w:t>
-      </w:r>
-      <w:proofErr w:type="spellStart"/>
-      <w:proofErr w:type="gramStart"/>
-      <w:r>
-        <w:rPr>
-          <w:rFonts w:ascii="Segoe UI Light" w:hAnsi="Segoe UI Light" w:cs="Segoe UI Light"/>
-          <w:sz w:val="20"/>
-          <w:szCs w:val="20"/>
-        </w:rPr>
-        <w:t>control.json</w:t>
-      </w:r>
-      <w:proofErr w:type="spellEnd"/>
-      <w:proofErr w:type="gramEnd"/>
-      <w:r>
-        <w:rPr>
-          <w:rFonts w:ascii="Segoe UI Light" w:hAnsi="Segoe UI Light" w:cs="Segoe UI Light"/>
-          <w:sz w:val="20"/>
-          <w:szCs w:val="20"/>
-        </w:rPr>
-        <w:t>.</w:t>
-      </w:r>
-      <w:bookmarkEnd w:id="11"/>
+      <w:bookmarkStart w:id="9" w:name="_Toc224039365"/>
+      <w:r>
+        <w:rPr>
+          <w:rFonts w:ascii="Segoe UI Light" w:hAnsi="Segoe UI Light" w:cs="Segoe UI Light"/>
+          <w:sz w:val="20"/>
+          <w:szCs w:val="20"/>
+        </w:rPr>
+        <w:t>Se actualizó el archivo control.json.</w:t>
+      </w:r>
+      <w:bookmarkEnd w:id="9"/>
     </w:p>
     <w:p>
       <w:pPr>
@@ -2605,7 +2555,7 @@
           <w:szCs w:val="20"/>
         </w:rPr>
       </w:pPr>
-      <w:bookmarkStart w:id="12" w:name="_Toc224039366"/>
+      <w:bookmarkStart w:id="10" w:name="_Toc224039366"/>
       <w:r>
         <w:rPr>
           <w:rFonts w:ascii="Segoe UI Light" w:hAnsi="Segoe UI Light" w:cs="Segoe UI Light"/>
@@ -2615,7 +2565,7 @@
         <w:lastRenderedPageBreak/>
         <w:t>Se realizaron ajustes en la lógica del proceso de validación del aplicativo.</w:t>
       </w:r>
-      <w:bookmarkEnd w:id="12"/>
+      <w:bookmarkEnd w:id="10"/>
     </w:p>
     <w:p>
       <w:pPr>
@@ -2628,7 +2578,7 @@
           <w:szCs w:val="20"/>
         </w:rPr>
       </w:pPr>
-      <w:bookmarkStart w:id="13" w:name="_Toc224039367"/>
+      <w:bookmarkStart w:id="11" w:name="_Toc224039367"/>
       <w:r>
         <w:rPr>
           <w:rFonts w:ascii="Segoe UI Light" w:hAnsi="Segoe UI Light" w:cs="Segoe UI Light"/>
@@ -2636,6 +2586,110 @@
           <w:szCs w:val="20"/>
         </w:rPr>
         <w:t>Versiones incorporadas</w:t>
+      </w:r>
+      <w:bookmarkEnd w:id="11"/>
+    </w:p>
+    <w:p>
+      <w:pPr>
+        <w:spacing w:line="276" w:lineRule="auto"/>
+        <w:jc w:val="both"/>
+        <w:outlineLvl w:val="0"/>
+        <w:rPr>
+          <w:rFonts w:ascii="Segoe UI Light" w:hAnsi="Segoe UI Light" w:cs="Segoe UI Light"/>
+          <w:sz w:val="20"/>
+          <w:szCs w:val="20"/>
+        </w:rPr>
+      </w:pPr>
+      <w:bookmarkStart w:id="12" w:name="_Toc224039368"/>
+      <w:r>
+        <w:rPr>
+          <w:rFonts w:ascii="Segoe UI Light" w:hAnsi="Segoe UI Light" w:cs="Segoe UI Light"/>
+          <w:sz w:val="20"/>
+          <w:szCs w:val="20"/>
+        </w:rPr>
+        <w:t xml:space="preserve">Se incorporan las versiones 1.1 </w:t>
+      </w:r>
+      <w:r>
+        <w:rPr>
+          <w:rFonts w:ascii="Segoe UI Light" w:hAnsi="Segoe UI Light" w:cs="Segoe UI Light"/>
+          <w:sz w:val="20"/>
+          <w:szCs w:val="20"/>
+        </w:rPr>
+        <w:t xml:space="preserve">para </w:t>
+      </w:r>
+      <w:r>
+        <w:rPr>
+          <w:rFonts w:ascii="Segoe UI Light" w:hAnsi="Segoe UI Light" w:cs="Segoe UI Light"/>
+          <w:sz w:val="20"/>
+          <w:szCs w:val="20"/>
+        </w:rPr>
+        <w:t xml:space="preserve">las series </w:t>
+      </w:r>
+      <w:r>
+        <w:rPr>
+          <w:rFonts w:ascii="Segoe UI Light" w:hAnsi="Segoe UI Light" w:cs="Segoe UI Light"/>
+          <w:sz w:val="20"/>
+          <w:szCs w:val="20"/>
+        </w:rPr>
+        <w:t>BS, BM y D, para las series A y P se actualiza a la versión 1.</w:t>
+      </w:r>
+      <w:r>
+        <w:rPr>
+          <w:rFonts w:ascii="Segoe UI Light" w:hAnsi="Segoe UI Light" w:cs="Segoe UI Light"/>
+          <w:sz w:val="20"/>
+          <w:szCs w:val="20"/>
+        </w:rPr>
+        <w:t>2</w:t>
+      </w:r>
+      <w:r>
+        <w:rPr>
+          <w:rFonts w:ascii="Segoe UI Light" w:hAnsi="Segoe UI Light" w:cs="Segoe UI Light"/>
+          <w:sz w:val="20"/>
+          <w:szCs w:val="20"/>
+        </w:rPr>
+        <w:t>.</w:t>
+      </w:r>
+      <w:bookmarkEnd w:id="12"/>
+      <w:r>
+        <w:rPr>
+          <w:rFonts w:ascii="Segoe UI Light" w:hAnsi="Segoe UI Light" w:cs="Segoe UI Light"/>
+          <w:sz w:val="20"/>
+          <w:szCs w:val="20"/>
+        </w:rPr>
+        <w:t xml:space="preserve"> </w:t>
+      </w:r>
+    </w:p>
+    <w:p>
+      <w:pPr>
+        <w:spacing w:line="276" w:lineRule="auto"/>
+        <w:jc w:val="both"/>
+        <w:outlineLvl w:val="0"/>
+        <w:rPr>
+          <w:rFonts w:ascii="Segoe UI Light" w:hAnsi="Segoe UI Light" w:cs="Segoe UI Light"/>
+          <w:b/>
+          <w:bCs/>
+          <w:sz w:val="20"/>
+          <w:szCs w:val="20"/>
+        </w:rPr>
+      </w:pPr>
+      <w:bookmarkStart w:id="13" w:name="_Toc224039369"/>
+      <w:r>
+        <w:rPr>
+          <w:rFonts w:ascii="Segoe UI Light" w:hAnsi="Segoe UI Light" w:cs="Segoe UI Light"/>
+          <w:sz w:val="20"/>
+          <w:szCs w:val="20"/>
+        </w:rPr>
+        <w:t>Estas modificaciones permiten que el sistema valide correctamente los archivos REM correspondientes a los nuevos períodos estadísticos</w:t>
+      </w:r>
+      <w:r>
+        <w:rPr>
+          <w:rFonts w:ascii="Segoe UI Light" w:hAnsi="Segoe UI Light" w:cs="Segoe UI Light"/>
+          <w:b/>
+          <w:bCs/>
+          <w:sz w:val="20"/>
+          <w:szCs w:val="20"/>
+        </w:rPr>
+        <w:t>.</w:t>
       </w:r>
       <w:bookmarkEnd w:id="13"/>
     </w:p>
@@ -2646,68 +2700,12 @@
         <w:outlineLvl w:val="0"/>
         <w:rPr>
           <w:rFonts w:ascii="Segoe UI Light" w:hAnsi="Segoe UI Light" w:cs="Segoe UI Light"/>
-          <w:sz w:val="20"/>
-          <w:szCs w:val="20"/>
-        </w:rPr>
-      </w:pPr>
-      <w:bookmarkStart w:id="14" w:name="_Toc224039368"/>
-      <w:r>
-        <w:rPr>
-          <w:rFonts w:ascii="Segoe UI Light" w:hAnsi="Segoe UI Light" w:cs="Segoe UI Light"/>
-          <w:sz w:val="20"/>
-          <w:szCs w:val="20"/>
-        </w:rPr>
-        <w:t xml:space="preserve">Se incorporan las versiones 1.1 </w:t>
-      </w:r>
-      <w:r>
-        <w:rPr>
-          <w:rFonts w:ascii="Segoe UI Light" w:hAnsi="Segoe UI Light" w:cs="Segoe UI Light"/>
-          <w:sz w:val="20"/>
-          <w:szCs w:val="20"/>
-        </w:rPr>
-        <w:t xml:space="preserve">para </w:t>
-      </w:r>
-      <w:r>
-        <w:rPr>
-          <w:rFonts w:ascii="Segoe UI Light" w:hAnsi="Segoe UI Light" w:cs="Segoe UI Light"/>
-          <w:sz w:val="20"/>
-          <w:szCs w:val="20"/>
-        </w:rPr>
-        <w:t xml:space="preserve">las series </w:t>
-      </w:r>
-      <w:r>
-        <w:rPr>
-          <w:rFonts w:ascii="Segoe UI Light" w:hAnsi="Segoe UI Light" w:cs="Segoe UI Light"/>
-          <w:sz w:val="20"/>
-          <w:szCs w:val="20"/>
-        </w:rPr>
-        <w:t>BS, BM y D, para las series A y P se actualiza a la versión 1.</w:t>
-      </w:r>
-      <w:r>
-        <w:rPr>
-          <w:rFonts w:ascii="Segoe UI Light" w:hAnsi="Segoe UI Light" w:cs="Segoe UI Light"/>
-          <w:sz w:val="20"/>
-          <w:szCs w:val="20"/>
-        </w:rPr>
-        <w:t>2</w:t>
-      </w:r>
-      <w:r>
-        <w:rPr>
-          <w:rFonts w:ascii="Segoe UI Light" w:hAnsi="Segoe UI Light" w:cs="Segoe UI Light"/>
-          <w:sz w:val="20"/>
-          <w:szCs w:val="20"/>
-        </w:rPr>
-        <w:t>.</w:t>
-      </w:r>
-      <w:bookmarkEnd w:id="14"/>
-      <w:r>
-        <w:rPr>
-          <w:rFonts w:ascii="Segoe UI Light" w:hAnsi="Segoe UI Light" w:cs="Segoe UI Light"/>
-          <w:sz w:val="20"/>
-          <w:szCs w:val="20"/>
-        </w:rPr>
-        <w:t xml:space="preserve"> </w:t>
-      </w:r>
+          <w:b/>
+          <w:bCs/>
+          <w:sz w:val="20"/>
+          <w:szCs w:val="20"/>
+        </w:rPr>
+      </w:pPr>
     </w:p>
     <w:p>
       <w:pPr>
@@ -2722,16 +2720,13 @@
           <w:szCs w:val="20"/>
         </w:rPr>
       </w:pPr>
-      <w:bookmarkStart w:id="15" w:name="_Toc224039369"/>
-      <w:r>
-        <w:rPr>
-          <w:rFonts w:ascii="Segoe UI Light" w:hAnsi="Segoe UI Light" w:cs="Segoe UI Light"/>
-          <w:sz w:val="20"/>
-          <w:szCs w:val="20"/>
-        </w:rPr>
-        <w:t>Estas modificaciones permiten que el sistema valide correctamente los archivos REM correspondientes a los nuevos períodos estadísticos</w:t>
-      </w:r>
-      <w:r>
+      <w:bookmarkStart w:id="14" w:name="_Toc224039370"/>
+    </w:p>
+    <w:p>
+      <w:pPr>
+        <w:spacing w:line="276" w:lineRule="auto"/>
+        <w:jc w:val="both"/>
+        <w:outlineLvl w:val="0"/>
         <w:rPr>
           <w:rFonts w:ascii="Segoe UI Light" w:hAnsi="Segoe UI Light" w:cs="Segoe UI Light"/>
           <w:b/>
@@ -2739,7 +2734,52 @@
           <w:sz w:val="20"/>
           <w:szCs w:val="20"/>
         </w:rPr>
-        <w:t>.</w:t>
+      </w:pPr>
+      <w:r>
+        <w:rPr>
+          <w:rFonts w:ascii="Segoe UI Light" w:hAnsi="Segoe UI Light" w:cs="Segoe UI Light"/>
+          <w:b/>
+          <w:bCs/>
+          <w:sz w:val="20"/>
+          <w:szCs w:val="20"/>
+        </w:rPr>
+        <w:t>INCORPORACION DE NUEVOS ESTABLECIMIENTOS DE SALUD</w:t>
+      </w:r>
+      <w:bookmarkEnd w:id="14"/>
+    </w:p>
+    <w:p>
+      <w:pPr>
+        <w:spacing w:line="276" w:lineRule="auto"/>
+        <w:jc w:val="both"/>
+        <w:outlineLvl w:val="0"/>
+        <w:rPr>
+          <w:rFonts w:ascii="Segoe UI Light" w:hAnsi="Segoe UI Light" w:cs="Segoe UI Light"/>
+          <w:b/>
+          <w:bCs/>
+          <w:sz w:val="20"/>
+          <w:szCs w:val="20"/>
+        </w:rPr>
+      </w:pPr>
+    </w:p>
+    <w:p>
+      <w:pPr>
+        <w:spacing w:line="276" w:lineRule="auto"/>
+        <w:jc w:val="both"/>
+        <w:outlineLvl w:val="0"/>
+        <w:rPr>
+          <w:rFonts w:ascii="Segoe UI Light" w:hAnsi="Segoe UI Light" w:cs="Segoe UI Light"/>
+          <w:sz w:val="20"/>
+          <w:szCs w:val="20"/>
+        </w:rPr>
+      </w:pPr>
+      <w:bookmarkStart w:id="15" w:name="_Toc224039371"/>
+      <w:r>
+        <w:rPr>
+          <w:rFonts w:ascii="Segoe UI Light" w:hAnsi="Segoe UI Light" w:cs="Segoe UI Light"/>
+          <w:sz w:val="20"/>
+          <w:szCs w:val="20"/>
+        </w:rPr>
+        <w:t>Se actualizó el archivo de establecimientos oficiales del sistema incorporando nuevos centros de salud.</w:t>
       </w:r>
       <w:bookmarkEnd w:id="15"/>
     </w:p>
@@ -2750,12 +2790,20 @@
         <w:outlineLvl w:val="0"/>
         <w:rPr>
           <w:rFonts w:ascii="Segoe UI Light" w:hAnsi="Segoe UI Light" w:cs="Segoe UI Light"/>
-          <w:b/>
-          <w:bCs/>
-          <w:sz w:val="20"/>
-          <w:szCs w:val="20"/>
-        </w:rPr>
-      </w:pPr>
+          <w:sz w:val="20"/>
+          <w:szCs w:val="20"/>
+        </w:rPr>
+      </w:pPr>
+      <w:bookmarkStart w:id="16" w:name="_Toc224039372"/>
+      <w:r>
+        <w:rPr>
+          <w:rFonts w:ascii="Segoe UI Light" w:hAnsi="Segoe UI Light" w:cs="Segoe UI Light"/>
+          <w:sz w:val="20"/>
+          <w:szCs w:val="20"/>
+        </w:rPr>
+        <w:t>Los siguientes establecimientos fueron agregados al archivo establecimientos-deis-minsal.xlsx:</w:t>
+      </w:r>
+      <w:bookmarkEnd w:id="16"/>
     </w:p>
     <w:p>
       <w:pPr>
@@ -2764,109 +2812,11 @@
         <w:outlineLvl w:val="0"/>
         <w:rPr>
           <w:rFonts w:ascii="Segoe UI Light" w:hAnsi="Segoe UI Light" w:cs="Segoe UI Light"/>
-          <w:b/>
-          <w:bCs/>
-          <w:sz w:val="20"/>
-          <w:szCs w:val="20"/>
-        </w:rPr>
-      </w:pPr>
-      <w:bookmarkStart w:id="16" w:name="_Toc224039370"/>
-    </w:p>
-    <w:p>
-      <w:pPr>
-        <w:spacing w:line="276" w:lineRule="auto"/>
-        <w:jc w:val="both"/>
-        <w:outlineLvl w:val="0"/>
-        <w:rPr>
-          <w:rFonts w:ascii="Segoe UI Light" w:hAnsi="Segoe UI Light" w:cs="Segoe UI Light"/>
-          <w:b/>
-          <w:bCs/>
-          <w:sz w:val="20"/>
-          <w:szCs w:val="20"/>
-        </w:rPr>
-      </w:pPr>
-      <w:r>
-        <w:rPr>
-          <w:rFonts w:ascii="Segoe UI Light" w:hAnsi="Segoe UI Light" w:cs="Segoe UI Light"/>
-          <w:b/>
-          <w:bCs/>
-          <w:sz w:val="20"/>
-          <w:szCs w:val="20"/>
-        </w:rPr>
-        <w:t>INCORPORACION DE NUEVOS ESTABLECIMIENTOS DE SALUD</w:t>
-      </w:r>
-      <w:bookmarkEnd w:id="16"/>
-    </w:p>
-    <w:p>
-      <w:pPr>
-        <w:spacing w:line="276" w:lineRule="auto"/>
-        <w:jc w:val="both"/>
-        <w:outlineLvl w:val="0"/>
-        <w:rPr>
-          <w:rFonts w:ascii="Segoe UI Light" w:hAnsi="Segoe UI Light" w:cs="Segoe UI Light"/>
-          <w:b/>
-          <w:bCs/>
-          <w:sz w:val="20"/>
-          <w:szCs w:val="20"/>
-        </w:rPr>
-      </w:pPr>
-    </w:p>
-    <w:p>
-      <w:pPr>
-        <w:spacing w:line="276" w:lineRule="auto"/>
-        <w:jc w:val="both"/>
-        <w:outlineLvl w:val="0"/>
-        <w:rPr>
-          <w:rFonts w:ascii="Segoe UI Light" w:hAnsi="Segoe UI Light" w:cs="Segoe UI Light"/>
-          <w:sz w:val="20"/>
-          <w:szCs w:val="20"/>
-        </w:rPr>
-      </w:pPr>
-      <w:bookmarkStart w:id="17" w:name="_Toc224039371"/>
-      <w:r>
-        <w:rPr>
-          <w:rFonts w:ascii="Segoe UI Light" w:hAnsi="Segoe UI Light" w:cs="Segoe UI Light"/>
-          <w:sz w:val="20"/>
-          <w:szCs w:val="20"/>
-        </w:rPr>
-        <w:t>Se actualizó el archivo de establecimientos oficiales del sistema incorporando nuevos centros de salud.</w:t>
-      </w:r>
-      <w:bookmarkEnd w:id="17"/>
-    </w:p>
-    <w:p>
-      <w:pPr>
-        <w:spacing w:line="276" w:lineRule="auto"/>
-        <w:jc w:val="both"/>
-        <w:outlineLvl w:val="0"/>
-        <w:rPr>
-          <w:rFonts w:ascii="Segoe UI Light" w:hAnsi="Segoe UI Light" w:cs="Segoe UI Light"/>
-          <w:sz w:val="20"/>
-          <w:szCs w:val="20"/>
-        </w:rPr>
-      </w:pPr>
-      <w:bookmarkStart w:id="18" w:name="_Toc224039372"/>
-      <w:r>
-        <w:rPr>
-          <w:rFonts w:ascii="Segoe UI Light" w:hAnsi="Segoe UI Light" w:cs="Segoe UI Light"/>
-          <w:sz w:val="20"/>
-          <w:szCs w:val="20"/>
-        </w:rPr>
-        <w:t>Los siguientes establecimientos fueron agregados al archivo establecimientos-deis-minsal.xlsx:</w:t>
-      </w:r>
-      <w:bookmarkEnd w:id="18"/>
-    </w:p>
-    <w:p>
-      <w:pPr>
-        <w:spacing w:line="276" w:lineRule="auto"/>
-        <w:jc w:val="both"/>
-        <w:outlineLvl w:val="0"/>
-        <w:rPr>
-          <w:rFonts w:ascii="Segoe UI Light" w:hAnsi="Segoe UI Light" w:cs="Segoe UI Light"/>
-          <w:sz w:val="20"/>
-          <w:szCs w:val="20"/>
-        </w:rPr>
-      </w:pPr>
-      <w:bookmarkStart w:id="19" w:name="_Toc224039373"/>
+          <w:sz w:val="20"/>
+          <w:szCs w:val="20"/>
+        </w:rPr>
+      </w:pPr>
+      <w:bookmarkStart w:id="17" w:name="_Toc224039373"/>
       <w:r>
         <w:rPr>
           <w:rFonts w:ascii="Segoe UI Light" w:hAnsi="Segoe UI Light" w:cs="Segoe UI Light"/>
@@ -2884,7 +2834,7 @@
         <w:tab/>
         <w:t>Establecimiento</w:t>
       </w:r>
-      <w:bookmarkEnd w:id="19"/>
+      <w:bookmarkEnd w:id="17"/>
     </w:p>
     <w:p>
       <w:pPr>
@@ -2902,7 +2852,7 @@
           <w:szCs w:val="20"/>
         </w:rPr>
       </w:pPr>
-      <w:bookmarkStart w:id="20" w:name="_Toc224039374"/>
+      <w:bookmarkStart w:id="18" w:name="_Toc224039374"/>
       <w:r>
         <w:rPr>
           <w:rFonts w:ascii="Segoe UI Light" w:hAnsi="Segoe UI Light" w:cs="Segoe UI Light"/>
@@ -2918,17 +2868,9 @@
           <w:szCs w:val="20"/>
         </w:rPr>
         <w:tab/>
-        <w:t>COSAM Lo Errázuriz</w:t>
-      </w:r>
-      <w:r>
-        <w:rPr>
-          <w:rFonts w:ascii="Segoe UI Light" w:hAnsi="Segoe UI Light" w:cs="Segoe UI Light"/>
-          <w:sz w:val="20"/>
-          <w:szCs w:val="20"/>
-        </w:rPr>
-        <w:t>.</w:t>
-      </w:r>
-      <w:bookmarkEnd w:id="20"/>
+        <w:t>COSAM Lo Errázuriz.</w:t>
+      </w:r>
+      <w:bookmarkEnd w:id="18"/>
     </w:p>
     <w:p>
       <w:pPr>
@@ -2946,7 +2888,7 @@
           <w:szCs w:val="20"/>
         </w:rPr>
       </w:pPr>
-      <w:bookmarkStart w:id="21" w:name="_Toc224039375"/>
+      <w:bookmarkStart w:id="19" w:name="_Toc224039375"/>
       <w:r>
         <w:rPr>
           <w:rFonts w:ascii="Segoe UI Light" w:hAnsi="Segoe UI Light" w:cs="Segoe UI Light"/>
@@ -2962,35 +2904,9 @@
           <w:szCs w:val="20"/>
         </w:rPr>
         <w:tab/>
-        <w:t xml:space="preserve">Centro de </w:t>
-      </w:r>
-      <w:proofErr w:type="spellStart"/>
-      <w:r>
-        <w:rPr>
-          <w:rFonts w:ascii="Segoe UI Light" w:hAnsi="Segoe UI Light" w:cs="Segoe UI Light"/>
-          <w:sz w:val="20"/>
-          <w:szCs w:val="20"/>
-        </w:rPr>
-        <w:t>Resolutividad</w:t>
-      </w:r>
-      <w:proofErr w:type="spellEnd"/>
-      <w:r>
-        <w:rPr>
-          <w:rFonts w:ascii="Segoe UI Light" w:hAnsi="Segoe UI Light" w:cs="Segoe UI Light"/>
-          <w:sz w:val="20"/>
-          <w:szCs w:val="20"/>
-        </w:rPr>
-        <w:t xml:space="preserve"> de la Atención Primaria (CREAP)</w:t>
-      </w:r>
-      <w:r>
-        <w:rPr>
-          <w:rFonts w:ascii="Segoe UI Light" w:hAnsi="Segoe UI Light" w:cs="Segoe UI Light"/>
-          <w:sz w:val="20"/>
-          <w:szCs w:val="20"/>
-        </w:rPr>
-        <w:t>.</w:t>
-      </w:r>
-      <w:bookmarkEnd w:id="21"/>
+        <w:t>Centro de Resolutividad de la Atención Primaria (CREAP).</w:t>
+      </w:r>
+      <w:bookmarkEnd w:id="19"/>
     </w:p>
     <w:p>
       <w:pPr>
@@ -3008,7 +2924,7 @@
           <w:szCs w:val="20"/>
         </w:rPr>
       </w:pPr>
-      <w:bookmarkStart w:id="22" w:name="_Toc224039376"/>
+      <w:bookmarkStart w:id="20" w:name="_Toc224039376"/>
       <w:r>
         <w:rPr>
           <w:rFonts w:ascii="Segoe UI Light" w:hAnsi="Segoe UI Light" w:cs="Segoe UI Light"/>
@@ -3024,15 +2940,81 @@
           <w:szCs w:val="20"/>
         </w:rPr>
         <w:tab/>
-        <w:t>CESFAM Erasmo Escala</w:t>
-      </w:r>
-      <w:r>
-        <w:rPr>
-          <w:rFonts w:ascii="Segoe UI Light" w:hAnsi="Segoe UI Light" w:cs="Segoe UI Light"/>
-          <w:sz w:val="20"/>
-          <w:szCs w:val="20"/>
-        </w:rPr>
-        <w:t>.</w:t>
+        <w:t>CESFAM Erasmo Escala.</w:t>
+      </w:r>
+      <w:bookmarkEnd w:id="20"/>
+    </w:p>
+    <w:p>
+      <w:pPr>
+        <w:spacing w:line="276" w:lineRule="auto"/>
+        <w:jc w:val="both"/>
+        <w:outlineLvl w:val="0"/>
+        <w:rPr>
+          <w:rFonts w:ascii="Segoe UI Light" w:hAnsi="Segoe UI Light" w:cs="Segoe UI Light"/>
+          <w:sz w:val="20"/>
+          <w:szCs w:val="20"/>
+        </w:rPr>
+      </w:pPr>
+      <w:bookmarkStart w:id="21" w:name="_Toc224039377"/>
+      <w:r>
+        <w:rPr>
+          <w:rFonts w:ascii="Segoe UI Light" w:hAnsi="Segoe UI Light" w:cs="Segoe UI Light"/>
+          <w:sz w:val="20"/>
+          <w:szCs w:val="20"/>
+        </w:rPr>
+        <w:t>Con esta actualización el sistema podrá validar correctamente los archivos REM provenientes de estos establecimientos.</w:t>
+      </w:r>
+      <w:bookmarkEnd w:id="21"/>
+    </w:p>
+    <w:p>
+      <w:pPr>
+        <w:spacing w:line="276" w:lineRule="auto"/>
+        <w:jc w:val="both"/>
+        <w:outlineLvl w:val="0"/>
+        <w:rPr>
+          <w:rFonts w:ascii="Segoe UI Light" w:hAnsi="Segoe UI Light" w:cs="Segoe UI Light"/>
+          <w:sz w:val="20"/>
+          <w:szCs w:val="20"/>
+        </w:rPr>
+      </w:pPr>
+    </w:p>
+    <w:p>
+      <w:pPr>
+        <w:spacing w:line="276" w:lineRule="auto"/>
+        <w:jc w:val="both"/>
+        <w:outlineLvl w:val="0"/>
+        <w:rPr>
+          <w:rFonts w:ascii="Segoe UI Light" w:hAnsi="Segoe UI Light" w:cs="Segoe UI Light"/>
+          <w:b/>
+          <w:bCs/>
+          <w:sz w:val="20"/>
+          <w:szCs w:val="20"/>
+        </w:rPr>
+      </w:pPr>
+      <w:bookmarkStart w:id="22" w:name="_Toc224039378"/>
+    </w:p>
+    <w:p>
+      <w:pPr>
+        <w:spacing w:line="276" w:lineRule="auto"/>
+        <w:jc w:val="both"/>
+        <w:outlineLvl w:val="0"/>
+        <w:rPr>
+          <w:rFonts w:ascii="Segoe UI Light" w:hAnsi="Segoe UI Light" w:cs="Segoe UI Light"/>
+          <w:b/>
+          <w:bCs/>
+          <w:sz w:val="20"/>
+          <w:szCs w:val="20"/>
+        </w:rPr>
+      </w:pPr>
+      <w:r>
+        <w:rPr>
+          <w:rFonts w:ascii="Segoe UI Light" w:hAnsi="Segoe UI Light" w:cs="Segoe UI Light"/>
+          <w:b/>
+          <w:bCs/>
+          <w:sz w:val="20"/>
+          <w:szCs w:val="20"/>
+        </w:rPr>
+        <w:t>MODIFICACION EN LA VALIDACION DEL NOMBRE DEL ESTABLECIMIENTO</w:t>
       </w:r>
       <w:bookmarkEnd w:id="22"/>
     </w:p>
@@ -3043,18 +3025,32 @@
         <w:outlineLvl w:val="0"/>
         <w:rPr>
           <w:rFonts w:ascii="Segoe UI Light" w:hAnsi="Segoe UI Light" w:cs="Segoe UI Light"/>
-          <w:sz w:val="20"/>
-          <w:szCs w:val="20"/>
-        </w:rPr>
-      </w:pPr>
-      <w:bookmarkStart w:id="23" w:name="_Toc224039377"/>
-      <w:r>
-        <w:rPr>
-          <w:rFonts w:ascii="Segoe UI Light" w:hAnsi="Segoe UI Light" w:cs="Segoe UI Light"/>
-          <w:sz w:val="20"/>
-          <w:szCs w:val="20"/>
-        </w:rPr>
-        <w:t>Con esta actualización el sistema podrá validar correctamente los archivos REM provenientes de estos establecimientos.</w:t>
+          <w:b/>
+          <w:bCs/>
+          <w:sz w:val="20"/>
+          <w:szCs w:val="20"/>
+        </w:rPr>
+      </w:pPr>
+    </w:p>
+    <w:p>
+      <w:pPr>
+        <w:spacing w:line="276" w:lineRule="auto"/>
+        <w:jc w:val="both"/>
+        <w:outlineLvl w:val="0"/>
+        <w:rPr>
+          <w:rFonts w:ascii="Segoe UI Light" w:hAnsi="Segoe UI Light" w:cs="Segoe UI Light"/>
+          <w:sz w:val="20"/>
+          <w:szCs w:val="20"/>
+        </w:rPr>
+      </w:pPr>
+      <w:bookmarkStart w:id="23" w:name="_Toc224039379"/>
+      <w:r>
+        <w:rPr>
+          <w:rFonts w:ascii="Segoe UI Light" w:hAnsi="Segoe UI Light" w:cs="Segoe UI Light"/>
+          <w:sz w:val="20"/>
+          <w:szCs w:val="20"/>
+        </w:rPr>
+        <w:t>se realizó un ajuste en el proceso de validación de las portadas de los archivos REM.</w:t>
       </w:r>
       <w:bookmarkEnd w:id="23"/>
     </w:p>
@@ -3069,144 +3065,48 @@
           <w:szCs w:val="20"/>
         </w:rPr>
       </w:pPr>
-    </w:p>
-    <w:p>
-      <w:pPr>
-        <w:spacing w:line="276" w:lineRule="auto"/>
-        <w:jc w:val="both"/>
-        <w:outlineLvl w:val="0"/>
-        <w:rPr>
-          <w:rFonts w:ascii="Segoe UI Light" w:hAnsi="Segoe UI Light" w:cs="Segoe UI Light"/>
-          <w:b/>
-          <w:bCs/>
-          <w:sz w:val="20"/>
-          <w:szCs w:val="20"/>
-        </w:rPr>
-      </w:pPr>
-      <w:bookmarkStart w:id="24" w:name="_Toc224039378"/>
-    </w:p>
-    <w:p>
-      <w:pPr>
-        <w:spacing w:line="276" w:lineRule="auto"/>
-        <w:jc w:val="both"/>
-        <w:outlineLvl w:val="0"/>
-        <w:rPr>
-          <w:rFonts w:ascii="Segoe UI Light" w:hAnsi="Segoe UI Light" w:cs="Segoe UI Light"/>
-          <w:b/>
-          <w:bCs/>
-          <w:sz w:val="20"/>
-          <w:szCs w:val="20"/>
-        </w:rPr>
-      </w:pPr>
-      <w:r>
-        <w:rPr>
-          <w:rFonts w:ascii="Segoe UI Light" w:hAnsi="Segoe UI Light" w:cs="Segoe UI Light"/>
-          <w:b/>
-          <w:bCs/>
-          <w:sz w:val="20"/>
-          <w:szCs w:val="20"/>
-        </w:rPr>
-        <w:t>MODIFICACION EN LA VALIDACION DEL NOMBRE DEL ESTABLECIMIENTO</w:t>
+      <w:bookmarkStart w:id="24" w:name="_Toc224039380"/>
+      <w:r>
+        <w:rPr>
+          <w:rFonts w:ascii="Segoe UI Light" w:hAnsi="Segoe UI Light" w:cs="Segoe UI Light"/>
+          <w:sz w:val="20"/>
+          <w:szCs w:val="20"/>
+        </w:rPr>
+        <w:t xml:space="preserve">Funcionamiento de las series </w:t>
+      </w:r>
+      <w:r>
+        <w:rPr>
+          <w:rFonts w:ascii="Segoe UI Light" w:hAnsi="Segoe UI Light" w:cs="Segoe UI Light"/>
+          <w:sz w:val="20"/>
+          <w:szCs w:val="20"/>
+        </w:rPr>
+        <w:t>h</w:t>
+      </w:r>
+      <w:r>
+        <w:rPr>
+          <w:rFonts w:ascii="Segoe UI Light" w:hAnsi="Segoe UI Light" w:cs="Segoe UI Light"/>
+          <w:sz w:val="20"/>
+          <w:szCs w:val="20"/>
+        </w:rPr>
+        <w:t xml:space="preserve">asta el año 2025, la validación del establecimiento </w:t>
+      </w:r>
+      <w:r>
+        <w:rPr>
+          <w:rFonts w:ascii="Segoe UI Light" w:hAnsi="Segoe UI Light" w:cs="Segoe UI Light"/>
+          <w:sz w:val="20"/>
+          <w:szCs w:val="20"/>
+        </w:rPr>
+        <w:t>continuará</w:t>
+      </w:r>
+      <w:r>
+        <w:rPr>
+          <w:rFonts w:ascii="Segoe UI Light" w:hAnsi="Segoe UI Light" w:cs="Segoe UI Light"/>
+          <w:sz w:val="20"/>
+          <w:szCs w:val="20"/>
+        </w:rPr>
+        <w:t xml:space="preserve"> considerando de forma conjunta:</w:t>
       </w:r>
       <w:bookmarkEnd w:id="24"/>
-    </w:p>
-    <w:p>
-      <w:pPr>
-        <w:spacing w:line="276" w:lineRule="auto"/>
-        <w:jc w:val="both"/>
-        <w:outlineLvl w:val="0"/>
-        <w:rPr>
-          <w:rFonts w:ascii="Segoe UI Light" w:hAnsi="Segoe UI Light" w:cs="Segoe UI Light"/>
-          <w:b/>
-          <w:bCs/>
-          <w:sz w:val="20"/>
-          <w:szCs w:val="20"/>
-        </w:rPr>
-      </w:pPr>
-    </w:p>
-    <w:p>
-      <w:pPr>
-        <w:spacing w:line="276" w:lineRule="auto"/>
-        <w:jc w:val="both"/>
-        <w:outlineLvl w:val="0"/>
-        <w:rPr>
-          <w:rFonts w:ascii="Segoe UI Light" w:hAnsi="Segoe UI Light" w:cs="Segoe UI Light"/>
-          <w:sz w:val="20"/>
-          <w:szCs w:val="20"/>
-        </w:rPr>
-      </w:pPr>
-      <w:bookmarkStart w:id="25" w:name="_Toc224039379"/>
-      <w:r>
-        <w:rPr>
-          <w:rFonts w:ascii="Segoe UI Light" w:hAnsi="Segoe UI Light" w:cs="Segoe UI Light"/>
-          <w:sz w:val="20"/>
-          <w:szCs w:val="20"/>
-        </w:rPr>
-        <w:t>s</w:t>
-      </w:r>
-      <w:r>
-        <w:rPr>
-          <w:rFonts w:ascii="Segoe UI Light" w:hAnsi="Segoe UI Light" w:cs="Segoe UI Light"/>
-          <w:sz w:val="20"/>
-          <w:szCs w:val="20"/>
-        </w:rPr>
-        <w:t>e realizó un ajuste en el proceso de validación de las portadas de los archivos REM.</w:t>
-      </w:r>
-      <w:bookmarkEnd w:id="25"/>
-    </w:p>
-    <w:p>
-      <w:pPr>
-        <w:spacing w:line="276" w:lineRule="auto"/>
-        <w:jc w:val="both"/>
-        <w:outlineLvl w:val="0"/>
-        <w:rPr>
-          <w:rFonts w:ascii="Segoe UI Light" w:hAnsi="Segoe UI Light" w:cs="Segoe UI Light"/>
-          <w:sz w:val="20"/>
-          <w:szCs w:val="20"/>
-        </w:rPr>
-      </w:pPr>
-      <w:bookmarkStart w:id="26" w:name="_Toc224039380"/>
-      <w:r>
-        <w:rPr>
-          <w:rFonts w:ascii="Segoe UI Light" w:hAnsi="Segoe UI Light" w:cs="Segoe UI Light"/>
-          <w:sz w:val="20"/>
-          <w:szCs w:val="20"/>
-        </w:rPr>
-        <w:t xml:space="preserve">Funcionamiento de las series </w:t>
-      </w:r>
-      <w:r>
-        <w:rPr>
-          <w:rFonts w:ascii="Segoe UI Light" w:hAnsi="Segoe UI Light" w:cs="Segoe UI Light"/>
-          <w:sz w:val="20"/>
-          <w:szCs w:val="20"/>
-        </w:rPr>
-        <w:t>h</w:t>
-      </w:r>
-      <w:r>
-        <w:rPr>
-          <w:rFonts w:ascii="Segoe UI Light" w:hAnsi="Segoe UI Light" w:cs="Segoe UI Light"/>
-          <w:sz w:val="20"/>
-          <w:szCs w:val="20"/>
-        </w:rPr>
-        <w:t xml:space="preserve">asta el año 2025, la validación del establecimiento </w:t>
-      </w:r>
-      <w:r>
-        <w:rPr>
-          <w:rFonts w:ascii="Segoe UI Light" w:hAnsi="Segoe UI Light" w:cs="Segoe UI Light"/>
-          <w:sz w:val="20"/>
-          <w:szCs w:val="20"/>
-        </w:rPr>
-        <w:t>continuará</w:t>
-      </w:r>
-      <w:r>
-        <w:rPr>
-          <w:rFonts w:ascii="Segoe UI Light" w:hAnsi="Segoe UI Light" w:cs="Segoe UI Light"/>
-          <w:sz w:val="20"/>
-          <w:szCs w:val="20"/>
-        </w:rPr>
-        <w:t xml:space="preserve"> considerando de forma conjunta:</w:t>
-      </w:r>
-      <w:bookmarkEnd w:id="26"/>
     </w:p>
     <w:p>
       <w:pPr>
@@ -3224,8 +3124,7 @@
           <w:szCs w:val="20"/>
         </w:rPr>
       </w:pPr>
-      <w:bookmarkStart w:id="27" w:name="_Toc224039381"/>
-      <w:proofErr w:type="spellStart"/>
+      <w:bookmarkStart w:id="25" w:name="_Toc224039381"/>
       <w:r>
         <w:rPr>
           <w:rFonts w:ascii="Segoe UI Light" w:hAnsi="Segoe UI Light" w:cs="Segoe UI Light"/>
@@ -3234,8 +3133,7 @@
         </w:rPr>
         <w:t>nombre_establecimiento_oficial</w:t>
       </w:r>
-      <w:bookmarkEnd w:id="27"/>
-      <w:proofErr w:type="spellEnd"/>
+      <w:bookmarkEnd w:id="25"/>
     </w:p>
     <w:p>
       <w:pPr>
@@ -3253,8 +3151,7 @@
           <w:szCs w:val="20"/>
         </w:rPr>
       </w:pPr>
-      <w:bookmarkStart w:id="28" w:name="_Toc224039382"/>
-      <w:proofErr w:type="spellStart"/>
+      <w:bookmarkStart w:id="26" w:name="_Toc224039382"/>
       <w:r>
         <w:rPr>
           <w:rFonts w:ascii="Segoe UI Light" w:hAnsi="Segoe UI Light" w:cs="Segoe UI Light"/>
@@ -3263,8 +3160,7 @@
         </w:rPr>
         <w:t>nombre_establecimiento_alias</w:t>
       </w:r>
-      <w:bookmarkEnd w:id="28"/>
-      <w:proofErr w:type="spellEnd"/>
+      <w:bookmarkEnd w:id="26"/>
     </w:p>
     <w:p>
       <w:pPr>
@@ -3277,7 +3173,7 @@
           <w:szCs w:val="20"/>
         </w:rPr>
       </w:pPr>
-      <w:bookmarkStart w:id="29" w:name="_Toc224039383"/>
+      <w:bookmarkStart w:id="27" w:name="_Toc224039383"/>
       <w:r>
         <w:rPr>
           <w:rFonts w:ascii="Segoe UI Light" w:hAnsi="Segoe UI Light" w:cs="Segoe UI Light"/>
@@ -3327,7 +3223,7 @@
         </w:rPr>
         <w:t>artir de las series correspondientes al año 2026, la validación se realiza exclusivamente utilizando la columna:</w:t>
       </w:r>
-      <w:bookmarkEnd w:id="29"/>
+      <w:bookmarkEnd w:id="27"/>
     </w:p>
     <w:p>
       <w:pPr>
@@ -3345,8 +3241,7 @@
           <w:szCs w:val="20"/>
         </w:rPr>
       </w:pPr>
-      <w:bookmarkStart w:id="30" w:name="_Toc224039384"/>
-      <w:proofErr w:type="spellStart"/>
+      <w:bookmarkStart w:id="28" w:name="_Toc224039384"/>
       <w:r>
         <w:rPr>
           <w:rFonts w:ascii="Segoe UI Light" w:hAnsi="Segoe UI Light" w:cs="Segoe UI Light"/>
@@ -3355,8 +3250,7 @@
         </w:rPr>
         <w:t>nombre_establecimiento_oficial</w:t>
       </w:r>
-      <w:bookmarkEnd w:id="30"/>
-      <w:proofErr w:type="spellEnd"/>
+      <w:bookmarkEnd w:id="28"/>
     </w:p>
     <w:p>
       <w:pPr>
@@ -3369,7 +3263,7 @@
           <w:szCs w:val="20"/>
         </w:rPr>
       </w:pPr>
-      <w:bookmarkStart w:id="31" w:name="_Toc224039385"/>
+      <w:bookmarkStart w:id="29" w:name="_Toc224039385"/>
       <w:r>
         <w:rPr>
           <w:rFonts w:ascii="Segoe UI Light" w:hAnsi="Segoe UI Light" w:cs="Segoe UI Light"/>
@@ -3446,7 +3340,7 @@
         </w:rPr>
         <w:t>.</w:t>
       </w:r>
-      <w:bookmarkEnd w:id="31"/>
+      <w:bookmarkEnd w:id="29"/>
     </w:p>
     <w:p>
       <w:pPr>
@@ -3459,7 +3353,7 @@
           <w:szCs w:val="16"/>
         </w:rPr>
       </w:pPr>
-      <w:bookmarkStart w:id="32" w:name="_Toc224039386"/>
+      <w:bookmarkStart w:id="30" w:name="_Toc224039386"/>
       <w:r>
         <w:rPr>
           <w:rFonts w:ascii="Segoe UI Light" w:hAnsi="Segoe UI Light" w:cs="Segoe UI Light"/>
@@ -3524,7 +3418,7 @@
         </w:rPr>
         <w:t>Figura 1. Botón Buscar Establecimiento, Matriz la serie A año 2026</w:t>
       </w:r>
-      <w:bookmarkEnd w:id="32"/>
+      <w:bookmarkEnd w:id="30"/>
     </w:p>
     <w:p>
       <w:pPr>
@@ -3565,7 +3459,7 @@
           <w:szCs w:val="20"/>
         </w:rPr>
       </w:pPr>
-      <w:bookmarkStart w:id="33" w:name="_Toc224039387"/>
+      <w:bookmarkStart w:id="31" w:name="_Toc224039387"/>
       <w:r>
         <w:rPr>
           <w:rFonts w:ascii="Segoe UI Light" w:hAnsi="Segoe UI Light" w:cs="Segoe UI Light"/>
@@ -3576,7 +3470,7 @@
         </w:rPr>
         <w:t>EJECUCIÓN DEL APLICATIVO DE VALIDACIÓN REM</w:t>
       </w:r>
-      <w:bookmarkEnd w:id="33"/>
+      <w:bookmarkEnd w:id="31"/>
       <w:r>
         <w:rPr>
           <w:rFonts w:ascii="Segoe UI Light" w:hAnsi="Segoe UI Light" w:cs="Segoe UI Light"/>
@@ -3609,7 +3503,7 @@
           <w:szCs w:val="20"/>
         </w:rPr>
       </w:pPr>
-      <w:bookmarkStart w:id="34" w:name="_Toc224039388"/>
+      <w:bookmarkStart w:id="32" w:name="_Toc224039388"/>
       <w:r>
         <w:rPr>
           <w:rFonts w:ascii="Segoe UI Light" w:hAnsi="Segoe UI Light" w:cs="Segoe UI Light"/>
@@ -3618,7 +3512,7 @@
         </w:rPr>
         <w:t>Esta actualización no modifica el procedimiento de uso del aplicativo, por lo que:</w:t>
       </w:r>
-      <w:bookmarkEnd w:id="34"/>
+      <w:bookmarkEnd w:id="32"/>
     </w:p>
     <w:p>
       <w:pPr>
@@ -3636,7 +3530,7 @@
           <w:szCs w:val="20"/>
         </w:rPr>
       </w:pPr>
-      <w:bookmarkStart w:id="35" w:name="_Toc224039389"/>
+      <w:bookmarkStart w:id="33" w:name="_Toc224039389"/>
       <w:r>
         <w:rPr>
           <w:rFonts w:ascii="Segoe UI Light" w:hAnsi="Segoe UI Light" w:cs="Segoe UI Light"/>
@@ -3645,7 +3539,7 @@
         </w:rPr>
         <w:t>El proceso de ejecución del archivo validador.exe se mantiene sin cambios.</w:t>
       </w:r>
-      <w:bookmarkEnd w:id="35"/>
+      <w:bookmarkEnd w:id="33"/>
     </w:p>
     <w:p>
       <w:pPr>
@@ -3663,7 +3557,7 @@
           <w:szCs w:val="20"/>
         </w:rPr>
       </w:pPr>
-      <w:bookmarkStart w:id="36" w:name="_Toc224039390"/>
+      <w:bookmarkStart w:id="34" w:name="_Toc224039390"/>
       <w:r>
         <w:rPr>
           <w:rFonts w:ascii="Segoe UI Light" w:hAnsi="Segoe UI Light" w:cs="Segoe UI Light"/>
@@ -3672,7 +3566,7 @@
         </w:rPr>
         <w:t>La estructura de carpetas del aplicativo permanece igual.</w:t>
       </w:r>
-      <w:bookmarkEnd w:id="36"/>
+      <w:bookmarkEnd w:id="34"/>
     </w:p>
     <w:p>
       <w:pPr>
@@ -3690,7 +3584,7 @@
           <w:szCs w:val="20"/>
         </w:rPr>
       </w:pPr>
-      <w:bookmarkStart w:id="37" w:name="_Toc224039391"/>
+      <w:bookmarkStart w:id="35" w:name="_Toc224039391"/>
       <w:r>
         <w:rPr>
           <w:rFonts w:ascii="Segoe UI Light" w:hAnsi="Segoe UI Light" w:cs="Segoe UI Light"/>
@@ -3698,6 +3592,82 @@
           <w:szCs w:val="20"/>
         </w:rPr>
         <w:t>Los reportes generados continúan utilizando el mismo formato.</w:t>
+      </w:r>
+      <w:bookmarkEnd w:id="35"/>
+    </w:p>
+    <w:p>
+      <w:pPr>
+        <w:spacing w:line="276" w:lineRule="auto"/>
+        <w:jc w:val="both"/>
+        <w:outlineLvl w:val="0"/>
+        <w:rPr>
+          <w:rFonts w:ascii="Segoe UI Light" w:hAnsi="Segoe UI Light" w:cs="Segoe UI Light"/>
+          <w:b/>
+          <w:bCs/>
+          <w:sz w:val="20"/>
+          <w:szCs w:val="20"/>
+        </w:rPr>
+      </w:pPr>
+    </w:p>
+    <w:p>
+      <w:pPr>
+        <w:spacing w:line="276" w:lineRule="auto"/>
+        <w:jc w:val="both"/>
+        <w:outlineLvl w:val="0"/>
+        <w:rPr>
+          <w:rFonts w:ascii="Segoe UI Light" w:hAnsi="Segoe UI Light" w:cs="Segoe UI Light"/>
+          <w:b/>
+          <w:bCs/>
+          <w:sz w:val="20"/>
+          <w:szCs w:val="20"/>
+        </w:rPr>
+      </w:pPr>
+      <w:bookmarkStart w:id="36" w:name="_Toc224039392"/>
+      <w:r>
+        <w:rPr>
+          <w:rFonts w:ascii="Segoe UI Light" w:hAnsi="Segoe UI Light" w:cs="Segoe UI Light"/>
+          <w:b/>
+          <w:bCs/>
+          <w:sz w:val="20"/>
+          <w:szCs w:val="20"/>
+        </w:rPr>
+        <w:t>MODIFICACIÓN EN EL FORMATO DE NOMBRE DE ARCHIVOS REM PARA SERIES DE AÑOS ANTERIORES</w:t>
+      </w:r>
+      <w:bookmarkEnd w:id="36"/>
+    </w:p>
+    <w:p>
+      <w:pPr>
+        <w:spacing w:line="276" w:lineRule="auto"/>
+        <w:jc w:val="both"/>
+        <w:outlineLvl w:val="0"/>
+        <w:rPr>
+          <w:rFonts w:ascii="Segoe UI Light" w:hAnsi="Segoe UI Light" w:cs="Segoe UI Light"/>
+          <w:b/>
+          <w:bCs/>
+          <w:sz w:val="20"/>
+          <w:szCs w:val="20"/>
+        </w:rPr>
+      </w:pPr>
+    </w:p>
+    <w:p>
+      <w:pPr>
+        <w:spacing w:line="276" w:lineRule="auto"/>
+        <w:jc w:val="both"/>
+        <w:outlineLvl w:val="0"/>
+        <w:rPr>
+          <w:rFonts w:ascii="Segoe UI Light" w:hAnsi="Segoe UI Light" w:cs="Segoe UI Light"/>
+          <w:sz w:val="20"/>
+          <w:szCs w:val="20"/>
+        </w:rPr>
+      </w:pPr>
+      <w:bookmarkStart w:id="37" w:name="_Toc224039393"/>
+      <w:r>
+        <w:rPr>
+          <w:rFonts w:ascii="Segoe UI Light" w:hAnsi="Segoe UI Light" w:cs="Segoe UI Light"/>
+          <w:sz w:val="20"/>
+          <w:szCs w:val="20"/>
+        </w:rPr>
+        <w:t>A partir de la actualización del aplicativo, se incorpora una modificación en la estructura del nombre de los archivos REM cuando estos corresponden a series de años anteriores al año en curso.</w:t>
       </w:r>
       <w:bookmarkEnd w:id="37"/>
     </w:p>
@@ -3708,12 +3678,52 @@
         <w:outlineLvl w:val="0"/>
         <w:rPr>
           <w:rFonts w:ascii="Segoe UI Light" w:hAnsi="Segoe UI Light" w:cs="Segoe UI Light"/>
-          <w:b/>
-          <w:bCs/>
-          <w:sz w:val="20"/>
-          <w:szCs w:val="20"/>
-        </w:rPr>
-      </w:pPr>
+          <w:sz w:val="20"/>
+          <w:szCs w:val="20"/>
+        </w:rPr>
+      </w:pPr>
+      <w:bookmarkStart w:id="38" w:name="_Toc224039394"/>
+      <w:r>
+        <w:rPr>
+          <w:rFonts w:ascii="Segoe UI Light" w:hAnsi="Segoe UI Light" w:cs="Segoe UI Light"/>
+          <w:sz w:val="20"/>
+          <w:szCs w:val="20"/>
+        </w:rPr>
+        <w:t>Para los archivos correspondientes al año estadístico en curso, el formato de nombre del archivo se mantiene sin cambios, siguiendo la estructura definida previamente en e</w:t>
+      </w:r>
+      <w:r>
+        <w:rPr>
+          <w:rFonts w:ascii="Segoe UI Light" w:hAnsi="Segoe UI Light" w:cs="Segoe UI Light"/>
+          <w:sz w:val="20"/>
+          <w:szCs w:val="20"/>
+        </w:rPr>
+        <w:t>l</w:t>
+      </w:r>
+      <w:r>
+        <w:rPr>
+          <w:rFonts w:ascii="Segoe UI Light" w:hAnsi="Segoe UI Light" w:cs="Segoe UI Light"/>
+          <w:sz w:val="20"/>
+          <w:szCs w:val="20"/>
+        </w:rPr>
+        <w:t xml:space="preserve"> manual</w:t>
+      </w:r>
+      <w:r>
+        <w:rPr>
+          <w:rFonts w:ascii="Segoe UI Light" w:hAnsi="Segoe UI Light" w:cs="Segoe UI Light"/>
+          <w:sz w:val="20"/>
+          <w:szCs w:val="20"/>
+        </w:rPr>
+        <w:t xml:space="preserve"> de la versión anterior</w:t>
+      </w:r>
+      <w:r>
+        <w:rPr>
+          <w:rFonts w:ascii="Segoe UI Light" w:hAnsi="Segoe UI Light" w:cs="Segoe UI Light"/>
+          <w:sz w:val="20"/>
+          <w:szCs w:val="20"/>
+        </w:rPr>
+        <w:t>.</w:t>
+      </w:r>
+      <w:bookmarkEnd w:id="38"/>
     </w:p>
     <w:p>
       <w:pPr>
@@ -3722,24 +3732,10 @@
         <w:outlineLvl w:val="0"/>
         <w:rPr>
           <w:rFonts w:ascii="Segoe UI Light" w:hAnsi="Segoe UI Light" w:cs="Segoe UI Light"/>
-          <w:b/>
-          <w:bCs/>
-          <w:sz w:val="20"/>
-          <w:szCs w:val="20"/>
-        </w:rPr>
-      </w:pPr>
-      <w:bookmarkStart w:id="38" w:name="_Toc224039392"/>
-      <w:r>
-        <w:rPr>
-          <w:rFonts w:ascii="Segoe UI Light" w:hAnsi="Segoe UI Light" w:cs="Segoe UI Light"/>
-          <w:b/>
-          <w:bCs/>
-          <w:sz w:val="20"/>
-          <w:szCs w:val="20"/>
-        </w:rPr>
-        <w:t>MODIFICACIÓN EN EL FORMATO DE NOMBRE DE ARCHIVOS REM PARA SERIES DE AÑOS ANTERIORES</w:t>
-      </w:r>
-      <w:bookmarkEnd w:id="38"/>
+          <w:sz w:val="20"/>
+          <w:szCs w:val="20"/>
+        </w:rPr>
+      </w:pPr>
     </w:p>
     <w:p>
       <w:pPr>
@@ -3748,12 +3744,20 @@
         <w:outlineLvl w:val="0"/>
         <w:rPr>
           <w:rFonts w:ascii="Segoe UI Light" w:hAnsi="Segoe UI Light" w:cs="Segoe UI Light"/>
-          <w:b/>
-          <w:bCs/>
-          <w:sz w:val="20"/>
-          <w:szCs w:val="20"/>
-        </w:rPr>
-      </w:pPr>
+          <w:sz w:val="20"/>
+          <w:szCs w:val="20"/>
+        </w:rPr>
+      </w:pPr>
+      <w:bookmarkStart w:id="39" w:name="_Toc224039395"/>
+      <w:r>
+        <w:rPr>
+          <w:rFonts w:ascii="Segoe UI Light" w:hAnsi="Segoe UI Light" w:cs="Segoe UI Light"/>
+          <w:sz w:val="20"/>
+          <w:szCs w:val="20"/>
+        </w:rPr>
+        <w:t>Sin embargo, cuando se requiera validar archivos REM correspondientes a series de años anteriores, el nombre del archivo deberá incorporar un sufijo que indique el año de la serie, agregado al final del nombre del archivo, antes de la extensión.</w:t>
+      </w:r>
+      <w:bookmarkEnd w:id="39"/>
     </w:p>
     <w:p>
       <w:pPr>
@@ -3766,126 +3770,16 @@
           <w:szCs w:val="20"/>
         </w:rPr>
       </w:pPr>
-      <w:bookmarkStart w:id="39" w:name="_Toc224039393"/>
-      <w:r>
-        <w:rPr>
-          <w:rFonts w:ascii="Segoe UI Light" w:hAnsi="Segoe UI Light" w:cs="Segoe UI Light"/>
-          <w:sz w:val="20"/>
-          <w:szCs w:val="20"/>
-        </w:rPr>
-        <w:t>A partir de la actualización del aplicativo, se incorpora una modificación en la estructura del nombre de los archivos REM cuando estos corresponden a series de años anteriores al año en curso.</w:t>
-      </w:r>
-      <w:bookmarkEnd w:id="39"/>
-    </w:p>
-    <w:p>
-      <w:pPr>
-        <w:spacing w:line="276" w:lineRule="auto"/>
-        <w:jc w:val="both"/>
-        <w:outlineLvl w:val="0"/>
-        <w:rPr>
-          <w:rFonts w:ascii="Segoe UI Light" w:hAnsi="Segoe UI Light" w:cs="Segoe UI Light"/>
-          <w:sz w:val="20"/>
-          <w:szCs w:val="20"/>
-        </w:rPr>
-      </w:pPr>
-      <w:bookmarkStart w:id="40" w:name="_Toc224039394"/>
-      <w:r>
-        <w:rPr>
-          <w:rFonts w:ascii="Segoe UI Light" w:hAnsi="Segoe UI Light" w:cs="Segoe UI Light"/>
-          <w:sz w:val="20"/>
-          <w:szCs w:val="20"/>
-        </w:rPr>
-        <w:t>Para los archivos correspondientes al año estadístico en curso, el formato de nombre del archivo se mantiene sin cambios, siguiendo la estructura definida previamente en e</w:t>
-      </w:r>
-      <w:r>
-        <w:rPr>
-          <w:rFonts w:ascii="Segoe UI Light" w:hAnsi="Segoe UI Light" w:cs="Segoe UI Light"/>
-          <w:sz w:val="20"/>
-          <w:szCs w:val="20"/>
-        </w:rPr>
-        <w:t>l</w:t>
-      </w:r>
-      <w:r>
-        <w:rPr>
-          <w:rFonts w:ascii="Segoe UI Light" w:hAnsi="Segoe UI Light" w:cs="Segoe UI Light"/>
-          <w:sz w:val="20"/>
-          <w:szCs w:val="20"/>
-        </w:rPr>
-        <w:t xml:space="preserve"> manual</w:t>
-      </w:r>
-      <w:r>
-        <w:rPr>
-          <w:rFonts w:ascii="Segoe UI Light" w:hAnsi="Segoe UI Light" w:cs="Segoe UI Light"/>
-          <w:sz w:val="20"/>
-          <w:szCs w:val="20"/>
-        </w:rPr>
-        <w:t xml:space="preserve"> de la versión anterior</w:t>
-      </w:r>
-      <w:r>
-        <w:rPr>
-          <w:rFonts w:ascii="Segoe UI Light" w:hAnsi="Segoe UI Light" w:cs="Segoe UI Light"/>
-          <w:sz w:val="20"/>
-          <w:szCs w:val="20"/>
-        </w:rPr>
-        <w:t>.</w:t>
+      <w:bookmarkStart w:id="40" w:name="_Toc224039396"/>
+      <w:r>
+        <w:rPr>
+          <w:rFonts w:ascii="Segoe UI Light" w:hAnsi="Segoe UI Light" w:cs="Segoe UI Light"/>
+          <w:sz w:val="20"/>
+          <w:szCs w:val="20"/>
+        </w:rPr>
+        <w:t>La estructura quedará de la siguiente forma:</w:t>
       </w:r>
       <w:bookmarkEnd w:id="40"/>
-    </w:p>
-    <w:p>
-      <w:pPr>
-        <w:spacing w:line="276" w:lineRule="auto"/>
-        <w:jc w:val="both"/>
-        <w:outlineLvl w:val="0"/>
-        <w:rPr>
-          <w:rFonts w:ascii="Segoe UI Light" w:hAnsi="Segoe UI Light" w:cs="Segoe UI Light"/>
-          <w:sz w:val="20"/>
-          <w:szCs w:val="20"/>
-        </w:rPr>
-      </w:pPr>
-    </w:p>
-    <w:p>
-      <w:pPr>
-        <w:spacing w:line="276" w:lineRule="auto"/>
-        <w:jc w:val="both"/>
-        <w:outlineLvl w:val="0"/>
-        <w:rPr>
-          <w:rFonts w:ascii="Segoe UI Light" w:hAnsi="Segoe UI Light" w:cs="Segoe UI Light"/>
-          <w:sz w:val="20"/>
-          <w:szCs w:val="20"/>
-        </w:rPr>
-      </w:pPr>
-      <w:bookmarkStart w:id="41" w:name="_Toc224039395"/>
-      <w:r>
-        <w:rPr>
-          <w:rFonts w:ascii="Segoe UI Light" w:hAnsi="Segoe UI Light" w:cs="Segoe UI Light"/>
-          <w:sz w:val="20"/>
-          <w:szCs w:val="20"/>
-        </w:rPr>
-        <w:t>Sin embargo, cuando se requiera validar archivos REM correspondientes a series de años anteriores, el nombre del archivo deberá incorporar un sufijo que indique el año de la serie, agregado al final del nombre del archivo, antes de la extensión.</w:t>
-      </w:r>
-      <w:bookmarkEnd w:id="41"/>
-    </w:p>
-    <w:p>
-      <w:pPr>
-        <w:spacing w:line="276" w:lineRule="auto"/>
-        <w:jc w:val="both"/>
-        <w:outlineLvl w:val="0"/>
-        <w:rPr>
-          <w:rFonts w:ascii="Segoe UI Light" w:hAnsi="Segoe UI Light" w:cs="Segoe UI Light"/>
-          <w:sz w:val="20"/>
-          <w:szCs w:val="20"/>
-        </w:rPr>
-      </w:pPr>
-      <w:bookmarkStart w:id="42" w:name="_Toc224039396"/>
-      <w:r>
-        <w:rPr>
-          <w:rFonts w:ascii="Segoe UI Light" w:hAnsi="Segoe UI Light" w:cs="Segoe UI Light"/>
-          <w:sz w:val="20"/>
-          <w:szCs w:val="20"/>
-        </w:rPr>
-        <w:t>La estructura quedará de la siguiente forma:</w:t>
-      </w:r>
-      <w:bookmarkEnd w:id="42"/>
     </w:p>
     <w:p>
       <w:pPr>
@@ -3903,7 +3797,7 @@
           <w:szCs w:val="20"/>
         </w:rPr>
       </w:pPr>
-      <w:bookmarkStart w:id="43" w:name="_Toc224039397"/>
+      <w:bookmarkStart w:id="41" w:name="_Toc224039397"/>
       <w:r>
         <w:rPr>
           <w:rFonts w:ascii="Segoe UI Light" w:hAnsi="Segoe UI Light" w:cs="Segoe UI Light"/>
@@ -3912,7 +3806,7 @@
         </w:rPr>
         <w:t>[Nombre base del archivo]-[AÑO].xlsm</w:t>
       </w:r>
-      <w:bookmarkEnd w:id="43"/>
+      <w:bookmarkEnd w:id="41"/>
     </w:p>
     <w:p>
       <w:pPr>
@@ -3925,7 +3819,7 @@
           <w:szCs w:val="20"/>
         </w:rPr>
       </w:pPr>
-      <w:bookmarkStart w:id="44" w:name="_Toc224039398"/>
+      <w:bookmarkStart w:id="42" w:name="_Toc224039398"/>
       <w:r>
         <w:rPr>
           <w:rFonts w:ascii="Segoe UI Light" w:hAnsi="Segoe UI Light" w:cs="Segoe UI Light"/>
@@ -3950,7 +3844,7 @@
         </w:rPr>
         <w:t>Si se desea validar un archivo correspondiente al año 2025, el nombre del archivo deberá seguir la siguiente estructura:</w:t>
       </w:r>
-      <w:bookmarkEnd w:id="44"/>
+      <w:bookmarkEnd w:id="42"/>
     </w:p>
     <w:p>
       <w:pPr>
@@ -3968,7 +3862,7 @@
           <w:szCs w:val="20"/>
         </w:rPr>
       </w:pPr>
-      <w:bookmarkStart w:id="45" w:name="_Toc224039399"/>
+      <w:bookmarkStart w:id="43" w:name="_Toc224039399"/>
       <w:r>
         <w:rPr>
           <w:rFonts w:ascii="Segoe UI Light" w:hAnsi="Segoe UI Light" w:cs="Segoe UI Light"/>
@@ -3977,7 +3871,7 @@
         </w:rPr>
         <w:t>111783BM06V1-2025.xlsm</w:t>
       </w:r>
-      <w:bookmarkEnd w:id="45"/>
+      <w:bookmarkEnd w:id="43"/>
     </w:p>
     <w:p>
       <w:pPr>
@@ -3990,7 +3884,7 @@
           <w:szCs w:val="20"/>
         </w:rPr>
       </w:pPr>
-      <w:bookmarkStart w:id="46" w:name="_Toc224039400"/>
+      <w:bookmarkStart w:id="44" w:name="_Toc224039400"/>
       <w:r>
         <w:rPr>
           <w:rFonts w:ascii="Segoe UI Light" w:hAnsi="Segoe UI Light" w:cs="Segoe UI Light"/>
@@ -3999,7 +3893,7 @@
         </w:rPr>
         <w:t>Donde:</w:t>
       </w:r>
-      <w:bookmarkEnd w:id="46"/>
+      <w:bookmarkEnd w:id="44"/>
     </w:p>
     <w:p>
       <w:pPr>
@@ -4017,7 +3911,7 @@
           <w:szCs w:val="20"/>
         </w:rPr>
       </w:pPr>
-      <w:bookmarkStart w:id="47" w:name="_Toc224039401"/>
+      <w:bookmarkStart w:id="45" w:name="_Toc224039401"/>
       <w:r>
         <w:rPr>
           <w:rFonts w:ascii="Segoe UI Light" w:hAnsi="Segoe UI Light" w:cs="Segoe UI Light"/>
@@ -4026,7 +3920,7 @@
         </w:rPr>
         <w:t>111783BM06V1 corresponde al formato estándar del nombre del archivo REM.</w:t>
       </w:r>
-      <w:bookmarkEnd w:id="47"/>
+      <w:bookmarkEnd w:id="45"/>
     </w:p>
     <w:p>
       <w:pPr>
@@ -4044,7 +3938,7 @@
           <w:szCs w:val="20"/>
         </w:rPr>
       </w:pPr>
-      <w:bookmarkStart w:id="48" w:name="_Toc224039402"/>
+      <w:bookmarkStart w:id="46" w:name="_Toc224039402"/>
       <w:r>
         <w:rPr>
           <w:rFonts w:ascii="Segoe UI Light" w:hAnsi="Segoe UI Light" w:cs="Segoe UI Light"/>
@@ -4061,7 +3955,7 @@
         </w:rPr>
         <w:t>2025 corresponde al año de la serie que se desea validar.</w:t>
       </w:r>
-      <w:bookmarkEnd w:id="48"/>
+      <w:bookmarkEnd w:id="46"/>
     </w:p>
     <w:p>
       <w:pPr>
@@ -4079,34 +3973,16 @@
           <w:szCs w:val="20"/>
         </w:rPr>
       </w:pPr>
-      <w:bookmarkStart w:id="49" w:name="_Toc224039403"/>
-      <w:r>
-        <w:rPr>
-          <w:rFonts w:ascii="Segoe UI Light" w:hAnsi="Segoe UI Light" w:cs="Segoe UI Light"/>
-          <w:sz w:val="20"/>
-          <w:szCs w:val="20"/>
-        </w:rPr>
-        <w:t>.</w:t>
-      </w:r>
-      <w:proofErr w:type="spellStart"/>
-      <w:r>
-        <w:rPr>
-          <w:rFonts w:ascii="Segoe UI Light" w:hAnsi="Segoe UI Light" w:cs="Segoe UI Light"/>
-          <w:sz w:val="20"/>
-          <w:szCs w:val="20"/>
-        </w:rPr>
-        <w:t>xlsm</w:t>
-      </w:r>
-      <w:proofErr w:type="spellEnd"/>
-      <w:r>
-        <w:rPr>
-          <w:rFonts w:ascii="Segoe UI Light" w:hAnsi="Segoe UI Light" w:cs="Segoe UI Light"/>
-          <w:sz w:val="20"/>
-          <w:szCs w:val="20"/>
-        </w:rPr>
-        <w:t xml:space="preserve"> corresponde a la extensión del archivo.</w:t>
-      </w:r>
-      <w:bookmarkEnd w:id="49"/>
+      <w:bookmarkStart w:id="47" w:name="_Toc224039403"/>
+      <w:r>
+        <w:rPr>
+          <w:rFonts w:ascii="Segoe UI Light" w:hAnsi="Segoe UI Light" w:cs="Segoe UI Light"/>
+          <w:sz w:val="20"/>
+          <w:szCs w:val="20"/>
+        </w:rPr>
+        <w:t>.xlsm corresponde a la extensión del archivo.</w:t>
+      </w:r>
+      <w:bookmarkEnd w:id="47"/>
     </w:p>
     <w:p>
       <w:pPr>
@@ -4119,7 +3995,7 @@
           <w:szCs w:val="20"/>
         </w:rPr>
       </w:pPr>
-      <w:bookmarkStart w:id="50" w:name="_Toc224039404"/>
+      <w:bookmarkStart w:id="48" w:name="_Toc224039404"/>
       <w:r>
         <w:rPr>
           <w:rFonts w:ascii="Segoe UI Light" w:hAnsi="Segoe UI Light" w:cs="Segoe UI Light"/>
@@ -4128,7 +4004,7 @@
         </w:rPr>
         <w:t>Este sufijo permite al aplicativo identificar correctamente el año de la serie a validar, diferenciándolo de los archivos correspondientes al período estadístico en curso.</w:t>
       </w:r>
-      <w:bookmarkEnd w:id="50"/>
+      <w:bookmarkEnd w:id="48"/>
     </w:p>
     <w:p>
       <w:pPr>
@@ -4143,7 +4019,7 @@
           <w:szCs w:val="20"/>
         </w:rPr>
       </w:pPr>
-      <w:bookmarkStart w:id="51" w:name="_Toc224039405"/>
+      <w:bookmarkStart w:id="49" w:name="_Toc224039405"/>
       <w:r>
         <w:rPr>
           <w:rFonts w:ascii="Segoe UI Light" w:hAnsi="Segoe UI Light" w:cs="Segoe UI Light"/>
@@ -4152,7 +4028,7 @@
         </w:rPr>
         <w:t>En caso de que el archivo no incluya este sufijo cuando corresponda, el aplicativo podrá clasificarlo como inválido durante el proceso de validación.</w:t>
       </w:r>
-      <w:bookmarkEnd w:id="51"/>
+      <w:bookmarkEnd w:id="49"/>
     </w:p>
     <w:sectPr>
       <w:headerReference w:type="default" r:id="rId10"/>
@@ -6607,9 +6483,6 @@
 
 <file path=word/people.xml><?xml version="1.0" encoding="utf-8"?>
 <w15:people xmlns:wpc="http://schemas.microsoft.com/office/word/2010/wordprocessingCanvas" xmlns:cx="http://schemas.microsoft.com/office/drawing/2014/chartex" xmlns:cx1="http://schemas.microsoft.com/office/drawing/2015/9/8/chartex" xmlns:cx2="http://schemas.microsoft.com/office/drawing/2015/10/21/chartex" xmlns:cx3="http://schemas.microsoft.com/office/drawing/2016/5/9/chartex" xmlns:cx4="http://schemas.microsoft.com/office/drawing/2016/5/10/chartex" xmlns:cx5="http://schemas.microsoft.com/office/drawing/2016/5/11/chartex" xmlns:cx6="http://schemas.microsoft.com/office/drawing/2016/5/12/chartex" xmlns:cx7="http://schemas.microsoft.com/office/drawing/2016/5/13/chartex" xmlns:cx8="http://schemas.microsoft.com/office/drawing/2016/5/14/chartex" xmlns:mc="http://schemas.openxmlformats.org/markup-compatibility/2006" xmlns:aink="http://schemas.microsoft.com/office/drawing/2016/ink" xmlns:am3d="http://schemas.microsoft.com/office/drawing/2017/model3d" xmlns:o="urn:schemas-microsoft-com:office:office" xmlns:oel="http://schemas.microsoft.com/office/2019/extlst" xmlns:r="http://schemas.openxmlformats.org/officeDocument/2006/relationships" xmlns:m="http://schemas.openxmlformats.org/officeDocument/2006/math" xmlns:v="urn:schemas-microsoft-com:vml" xmlns:wp14="http://schemas.microsoft.com/office/word/2010/wordprocessingDrawing" xmlns:wp="http://schemas.openxmlformats.org/drawingml/2006/wordprocessingDrawing" xmlns:w10="urn:schemas-microsoft-com:office:word" xmlns:w="http://schemas.openxmlformats.org/wordprocessingml/2006/main" xmlns:w14="http://schemas.microsoft.com/office/word/2010/wordml" xmlns:w15="http://schemas.microsoft.com/office/word/2012/wordml" xmlns:w16cex="http://schemas.microsoft.com/office/word/2018/wordml/cex" xmlns:w16cid="http://schemas.microsoft.com/office/word/2016/wordml/cid" xmlns:w16="http://schemas.microsoft.com/office/word/2018/wordml" xmlns:w16du="http://schemas.microsoft.com/office/word/2023/wordml/word16du" xmlns:w16sdtdh="http://schemas.microsoft.com/office/word/2020/wordml/sdtdatahash" xmlns:w16sdtfl="http://schemas.microsoft.com/office/word/2024/wordml/sdtformatlock" xmlns:w16se="http://schemas.microsoft.com/office/word/2015/wordml/symex" xmlns:wpg="http://schemas.microsoft.com/office/word/2010/wordprocessingGroup" xmlns:wpi="http://schemas.microsoft.com/office/word/2010/wordprocessingInk" xmlns:wne="http://schemas.microsoft.com/office/word/2006/wordml" xmlns:wps="http://schemas.microsoft.com/office/word/2010/wordprocessingShape" mc:Ignorable="w14 w15 w16se w16cid w16 w16cex w16sdtdh w16sdtfl w16du wp14">
-  <w15:person w15:author="Rolando Andrés Cifuentes Cid">
-    <w15:presenceInfo w15:providerId="AD" w15:userId="S::rolando.cifuentes@redsalud.gob.cl::26fbd5f6-f408-4ea6-b62f-1558839a900a"/>
-  </w15:person>
   <w15:person w15:author="Karina Stapfer Jara">
     <w15:presenceInfo w15:providerId="AD" w15:userId="S::karina.stapfer@redsalud.gob.cl::0055cb3a-c2df-4d60-9b08-2c8b43537e70"/>
   </w15:person>
@@ -7232,6 +7105,7 @@
   <w:style w:type="character" w:default="1" w:styleId="Fuentedeprrafopredeter">
     <w:name w:val="Default Paragraph Font"/>
     <w:uiPriority w:val="1"/>
+    <w:semiHidden/>
     <w:unhideWhenUsed/>
   </w:style>
   <w:style w:type="table" w:default="1" w:styleId="Tablanormal">
@@ -8071,6 +7945,7 @@
     <w:rsid w:val="0010540E"/>
     <w:rsid w:val="0013634F"/>
     <w:rsid w:val="00174893"/>
+    <w:rsid w:val="001B49CB"/>
     <w:rsid w:val="002049F8"/>
     <w:rsid w:val="0021350A"/>
     <w:rsid w:val="002510A8"/>
@@ -8107,6 +7982,7 @@
     <w:rsid w:val="006A402B"/>
     <w:rsid w:val="006B5DB5"/>
     <w:rsid w:val="006D27DF"/>
+    <w:rsid w:val="00734791"/>
     <w:rsid w:val="00741A0D"/>
     <w:rsid w:val="00764A07"/>
     <w:rsid w:val="00797107"/>

</xml_diff>